<commit_message>
docs: fix cover page — Status field now shows Doc Rev 1.07 consistently
</commit_message>
<xml_diff>
--- a/docs/orbix-nichefinder-x-docs-v1.07.docx
+++ b/docs/orbix-nichefinder-x-docs-v1.07.docx
@@ -139,7 +139,7 @@
         </w:rPr>
         <w:t xml:space="preserve">  —  </w:t>
       </w:r>
-      <w:hyperlink w:history="1" r:id="rIdgllwtrotm_2p08bioid3c">
+      <w:hyperlink w:history="1" r:id="rId9lkxg__bmca3jomwtefwx">
         <w:r>
           <w:rPr>
             <w:rFonts w:ascii="Arial" w:cs="Arial" w:eastAsia="Arial" w:hAnsi="Arial"/>
@@ -499,7 +499,7 @@
                 <w:sz w:val="20"/>
                 <w:szCs w:val="20"/>
               </w:rPr>
-              <w:t xml:space="preserve">Released — Public  |  App v1.05  |  Doc Rev 1.06</w:t>
+              <w:t xml:space="preserve">Released — Public  |  App v1.05  |  Doc Rev 1.07</w:t>
             </w:r>
           </w:p>
         </w:tc>
@@ -1081,7 +1081,7 @@
               </w:rPr>
               <w:t xml:space="preserve">Discover your niche influencers with NicheFinder X, then plug those handles and insights straight into </w:t>
             </w:r>
-            <w:hyperlink w:history="1" r:id="rIdjolxxvujskhfs2lrsiieh">
+            <w:hyperlink w:history="1" r:id="rIdxe4ex4bnhzxottzjrgsti">
               <w:r>
                 <w:rPr>
                   <w:rFonts w:ascii="Arial" w:cs="Arial" w:eastAsia="Arial" w:hAnsi="Arial"/>
@@ -1109,7 +1109,7 @@
             <w:pPr>
               <w:spacing w:before="20" w:after="0"/>
             </w:pPr>
-            <w:hyperlink w:history="1" r:id="rIdpqbl5wqh_iqcrlkaw-kgn">
+            <w:hyperlink w:history="1" r:id="rId5fot3dnldqqm3aywt7-dn">
               <w:r>
                 <w:rPr>
                   <w:rFonts w:ascii="Arial" w:cs="Arial" w:eastAsia="Arial" w:hAnsi="Arial"/>
@@ -3077,7 +3077,7 @@
         </w:rPr>
         <w:t xml:space="preserve">Visit </w:t>
       </w:r>
-      <w:hyperlink w:history="1" r:id="rId7l98wgvjczsa4xwwbt75f">
+      <w:hyperlink w:history="1" r:id="rIdbdjekzptwr9fnimxnmsfh">
         <w:r>
           <w:rPr>
             <w:rFonts w:ascii="Arial" w:cs="Arial" w:eastAsia="Arial" w:hAnsi="Arial"/>
@@ -4615,7 +4615,7 @@
         </w:rPr>
         <w:t xml:space="preserve">Always download from: </w:t>
       </w:r>
-      <w:hyperlink w:history="1" r:id="rIdahb4cmydsbx7hbpandwoh">
+      <w:hyperlink w:history="1" r:id="rIda1ku7q1bbz0f5jevna_yt">
         <w:r>
           <w:rPr>
             <w:rFonts w:ascii="Arial" w:cs="Arial" w:eastAsia="Arial" w:hAnsi="Arial"/>

</xml_diff>

<commit_message>
fix: TOC — replace docx-js TableOfContents with proper complex field XML (begin/instrText/end). Add updateFields:true. TOC now populates automatically when Word opens the file.
</commit_message>
<xml_diff>
--- a/docs/orbix-nichefinder-x-docs-v1.07.docx
+++ b/docs/orbix-nichefinder-x-docs-v1.07.docx
@@ -139,7 +139,7 @@
         </w:rPr>
         <w:t xml:space="preserve">  —  </w:t>
       </w:r>
-      <w:hyperlink w:history="1" r:id="rId9lkxg__bmca3jomwtefwx">
+      <w:hyperlink w:history="1" r:id="rIdhlvbogyqhiuekte9ljdvv">
         <w:r>
           <w:rPr>
             <w:rFonts w:ascii="Arial" w:cs="Arial" w:eastAsia="Arial" w:hAnsi="Arial"/>
@@ -877,25 +877,38 @@
         <w:spacing w:before="120" w:after="120"/>
       </w:pPr>
     </w:p>
-    <w:sdt>
-      <w:sdtPr>
-        <w:alias w:val="Table of Contents"/>
-      </w:sdtPr>
-      <w:sdtContent>
-        <w:p>
-          <w:r>
-            <w:fldChar w:fldCharType="begin" w:dirty="true"/>
-            <w:instrText xml:space="preserve">TOC \h \o "1-3" \t "Heading 1,1,Heading 2,2,Heading 3,3"</w:instrText>
-            <w:fldChar w:fldCharType="separate"/>
-          </w:r>
-        </w:p>
-        <w:p>
-          <w:r>
-            <w:fldChar w:fldCharType="end"/>
-          </w:r>
-        </w:p>
-      </w:sdtContent>
-    </w:sdt>
+    <w:p>
+      <w:r>
+        <w:rPr>
+          <w:noProof/>
+        </w:rPr>
+        <w:fldChar w:fldCharType="begin" w:dirty="true"/>
+      </w:r>
+      <w:r>
+        <w:rPr>
+          <w:noProof/>
+        </w:rPr>
+        <w:instrText xml:space="preserve"> TOC \h \z \u </w:instrText>
+      </w:r>
+      <w:r>
+        <w:rPr>
+          <w:noProof/>
+        </w:rPr>
+        <w:fldChar w:fldCharType="separate"/>
+      </w:r>
+      <w:r>
+        <w:rPr>
+          <w:noProof/>
+        </w:rPr>
+        <w:t>Right-click this area and choose Update Field to populate the Table of Contents.</w:t>
+      </w:r>
+      <w:r>
+        <w:rPr>
+          <w:noProof/>
+        </w:rPr>
+        <w:fldChar w:fldCharType="end"/>
+      </w:r>
+    </w:p>
     <w:p>
       <w:r>
         <w:br w:type="page"/>
@@ -1081,7 +1094,7 @@
               </w:rPr>
               <w:t xml:space="preserve">Discover your niche influencers with NicheFinder X, then plug those handles and insights straight into </w:t>
             </w:r>
-            <w:hyperlink w:history="1" r:id="rIdxe4ex4bnhzxottzjrgsti">
+            <w:hyperlink w:history="1" r:id="rIdd4lruuuwoqosuo8z3-oxn">
               <w:r>
                 <w:rPr>
                   <w:rFonts w:ascii="Arial" w:cs="Arial" w:eastAsia="Arial" w:hAnsi="Arial"/>
@@ -1109,7 +1122,7 @@
             <w:pPr>
               <w:spacing w:before="20" w:after="0"/>
             </w:pPr>
-            <w:hyperlink w:history="1" r:id="rId5fot3dnldqqm3aywt7-dn">
+            <w:hyperlink w:history="1" r:id="rIdr4yepovj4g1marsd68yw6">
               <w:r>
                 <w:rPr>
                   <w:rFonts w:ascii="Arial" w:cs="Arial" w:eastAsia="Arial" w:hAnsi="Arial"/>
@@ -3077,7 +3090,7 @@
         </w:rPr>
         <w:t xml:space="preserve">Visit </w:t>
       </w:r>
-      <w:hyperlink w:history="1" r:id="rIdbdjekzptwr9fnimxnmsfh">
+      <w:hyperlink w:history="1" r:id="rId8efeo5cn-tahualtxdjqv">
         <w:r>
           <w:rPr>
             <w:rFonts w:ascii="Arial" w:cs="Arial" w:eastAsia="Arial" w:hAnsi="Arial"/>
@@ -4615,7 +4628,7 @@
         </w:rPr>
         <w:t xml:space="preserve">Always download from: </w:t>
       </w:r>
-      <w:hyperlink w:history="1" r:id="rIda1ku7q1bbz0f5jevna_yt">
+      <w:hyperlink w:history="1" r:id="rIdieesaoqyznm8uhdkpkqxv">
         <w:r>
           <w:rPr>
             <w:rFonts w:ascii="Arial" w:cs="Arial" w:eastAsia="Arial" w:hAnsi="Arial"/>

</xml_diff>